<commit_message>
Pre-tax framing: typical cooperative earns more before tax at the median, mean gap unestablished; tax explains two fifths
- 4.1, abstract, discussion, Section 6 and the proceedings abstract reworded; the fiscal closing line
  now presents both readings (subsidy vs mutual self-help) and the counterfactual states its payout assumption
- Discussion opens with a plain paragraph (box and "In plain terms" removed); tier rule in 3.4 restates
  the quantile criterion; Figure 6 ROA panel labelled after tax

Co-Authored-By: Claude Fable 5.1 <noreply@anthropic.com>
</commit_message>
<xml_diff>
--- a/paper/ICACCR2026_abstract_Nery_Victorino_Rangel.docx
+++ b/paper/ICACCR2026_abstract_Nery_Victorino_Rangel.docx
@@ -191,7 +191,7 @@
         <w:t xml:space="preserve">Results.</w:t>
       </w:r>
       <w:r>
-        <w:t xml:space="preserve"> Three results emerge. First, at comparable size cooperatives allocate nearly a fifth more of total assets to credit than banks nationally, operate at lower cost at the median, and show lower return volatility and a higher z-score. Before tax they earn about what banks of the same size earn, on an intermediation margin indistinguishable from the banks'; after tax they retain about two percentage points more, in substantial part because cooperative acts are exempt from income tax and social contribution. The pre-tax gap under controls is about three fifths of the after-tax one and is not established on the matched or common-support samples, so by the classification rule it is null while the after-tax gap is stable. The other differentials hold on every national definition of a bank. Credit intensity cannot be told apart from zero within macro-region, where the estimates are imprecise. Second, capital differs modestly in level and markedly in dispersion. The size-controlled mean gap is large and negative, yet the conditional mean is about seven times the conditional median, and the quantile coefficient is positive at the bottom of the capital distribution and negative at the top, crossing zero near the fortieth percentile. The mean gap comes largely from a bank upper tail. Fourteen percent of bank-quarters exceed a Basel ratio of 50 percent, against one percent of cooperative-quarters, and the tail sits among small standalone banks that barely intermediate. Restricting the comparison to deposit-funded banks roughly halves the gap, and the residual standard deviation of the capital ratio among cooperatives is about a third of the bank figure. Third, two differences often reported disappear once the comparison group is restricted to banks. Against all non-cooperatives, cooperatives appear to provision less and to earn narrower margins; against banks both coefficients are close to zero. The broad-group provisioning gap comes from non-banking lenders whose provisioning ratios are nearly three times those of banks and cooperatives. At the conditional median cooperatives provision more, and no tercile of the capital distribution shows them provisioning less. Every surviving result keeps its sign under four winsorisation rules, without the largest banks, before and after the 2022 revision of the capital rules, and under weighted and unweighted matching. Selection into the full methodology biases the credit and profitability estimates towards zero.</w:t>
+        <w:t xml:space="preserve"> Three results emerge. First, at comparable size cooperatives allocate nearly a fifth more of total assets to credit than banks nationally, operate at lower cost at the median, and show lower return volatility and a higher z-score. Before tax the typical cooperative earns more than a comparable bank, on an intermediation margin indistinguishable from the banks': the conditional median differential is 1.4 percentage points and excludes zero, while the mean gap is significant in only two of four specifications, pulled towards zero by a high-earning bank upper tail, and is therefore null by the classification rule. After tax cooperatives retain about two percentage points more, a stable result; the pre-tax gap under controls is about three fifths of the after-tax one, so the exemption of cooperative acts from income tax and social contribution accounts for about two fifths of it. The other differentials hold on every national definition of a bank. Credit intensity cannot be told apart from zero within macro-region, where the estimates are imprecise. Second, capital differs modestly in level and markedly in dispersion. The size-controlled mean gap is large and negative, yet the conditional mean is about seven times the conditional median, and the quantile coefficient is positive at the bottom of the capital distribution and negative at the top, crossing zero near the fortieth percentile. The mean gap comes largely from a bank upper tail. Fourteen percent of bank-quarters exceed a Basel ratio of 50 percent, against one percent of cooperative-quarters, and the tail sits among small standalone banks that barely intermediate. Restricting the comparison to deposit-funded banks roughly halves the gap, and the residual standard deviation of the capital ratio among cooperatives is about a third of the bank figure. Third, two differences often reported disappear once the comparison group is restricted to banks. Against all non-cooperatives, cooperatives appear to provision less and to earn narrower margins; against banks both coefficients are close to zero. The broad-group provisioning gap comes from non-banking lenders whose provisioning ratios are nearly three times those of banks and cooperatives. At the conditional median cooperatives provision more, and no tercile of the capital distribution shows them provisioning less. Every surviving result keeps its sign under four winsorisation rules, without the largest banks, before and after the 2022 revision of the capital rules, and under weighted and unweighted matching. Selection into the full methodology biases the credit and profitability estimates towards zero.</w:t>
       </w:r>
     </w:p>
     <w:p>
@@ -206,7 +206,7 @@
         <w:t xml:space="preserve">Discussion.</w:t>
       </w:r>
       <w:r>
-        <w:t xml:space="preserve"> The surviving results describe a focused retail lender that channels a high share of its assets into member credit, runs that operation at low cost, earns an operating return similar to that of banks on similar spreads, retains more of it after tax and sits in a narrow band of the capital distribution. The results agree with Hesse and Čihák (2007) on lower capitalisation and lower return volatility and differ on profitability only after tax; before tax the two populations earn about the same, and the difference is the fiscal treatment of cooperative acts. At the thin end of the capital distribution, where supervisory concern attaches, cooperatives hold more capital than comparable banks and provision no less. Several differentials that look large at the mean are differentials in dispersion. Three analyst choices determined whether headline results existed: the comparison group, the reading of cumulative income fields as quarterly flows, and unweighted estimation on the matched sample. The estimates are conditional correlations on the largest cooperatives in the country, the provisioning ratio is an accounting variable, and the network backstop hypothesis needs consolidated data that IF.data does not carry.</w:t>
+        <w:t xml:space="preserve"> The surviving results describe a focused retail lender that channels a high share of its assets into member credit, runs that operation at low cost, earns a somewhat higher operating return than banks at the median on similar spreads, retains more of it after tax and sits in a narrow band of the capital distribution. The results agree with Hesse and Čihák (2007) on lower capitalisation and lower return volatility and differ on profitability; the fiscal treatment of cooperative acts accounts for about two fifths of the after-tax difference, and the pre-tax mean gap is not established, so the disagreement is narrower than the after-tax figures suggest. At the thin end of the capital distribution, where supervisory concern attaches, cooperatives hold more capital than comparable banks and provision no less. Several differentials that look large at the mean are differentials in dispersion. Three analyst choices determined whether headline results existed: the comparison group, the reading of cumulative income fields as quarterly flows, and unweighted estimation on the matched sample. The estimates are conditional correlations on the largest cooperatives in the country, the provisioning ratio is an accounting variable, and the network backstop hypothesis needs consolidated data that IF.data does not carry.</w:t>
       </w:r>
     </w:p>
     <w:p>
@@ -221,7 +221,7 @@
         <w:t xml:space="preserve">Contributions and Implications.</w:t>
       </w:r>
       <w:r>
-        <w:t xml:space="preserve"> The paper offers the first profile of cooperative behaviour under full Basel-style regulation in a large emerging market, on the full population of full-methodology institutions, together with two nulls that correct claims the same data appear to support under a looser comparison group. Methodologically, it sets out a protocol that defines peers on the regulator's own categories, reports a ladder of comparison groups, separates sector-wide from within-market differences, states how cumulative flows were converted to rates and reports the matched estimand. For proportionality, the results raise two margins beyond size: the treatment of integrated networks and their backstops, and the calibration of a benchmark against an average institution whose upper region cooperatives do not inhabit. A lighter requirement does not follow automatically, since the systemic externality and the public guarantee still apply. For the cooperative movement, a case resting on cost and return stability holds against every definition of a bank we tried, and one resting on profitability holds for the retained return and fails for the operating return. A case resting on more conservative provisioning does not.</w:t>
+        <w:t xml:space="preserve"> The paper offers the first profile of cooperative behaviour under full Basel-style regulation in a large emerging market, on the full population of full-methodology institutions, together with two nulls that correct claims the same data appear to support under a looser comparison group. Methodologically, it sets out a protocol that defines peers on the regulator's own categories, reports a ladder of comparison groups, separates sector-wide from within-market differences, states how cumulative flows were converted to rates and reports the matched estimand. For proportionality, the results raise two margins beyond size: the treatment of integrated networks and their backstops, and the calibration of a benchmark against an average institution whose upper region cooperatives do not inhabit. A lighter requirement does not follow automatically, since the systemic externality and the public guarantee still apply. For the cooperative movement, a case resting on cost and return stability holds against every definition of a bank we tried, and one resting on profitability holds for the retained return and, for the operating return, at the median rather than at the mean. A case resting on more conservative provisioning does not.</w:t>
       </w:r>
     </w:p>
     <w:p>

</xml_diff>

<commit_message>
Cuts to keep the paper under 8,000 words and the abstract under 1,500 by Word's count
Co-Authored-By: Claude Fable 5.1 <noreply@anthropic.com>
</commit_message>
<xml_diff>
--- a/paper/ICACCR2026_abstract_Nery_Victorino_Rangel.docx
+++ b/paper/ICACCR2026_abstract_Nery_Victorino_Rangel.docx
@@ -146,7 +146,7 @@
         <w:t xml:space="preserve">Background.</w:t>
       </w:r>
       <w:r>
-        <w:t xml:space="preserve"> Prudential regulation has converged on the Basel template, and national supervisors apply it in proportion to size, complexity and business model. Brazil sorts authorised institutions into five segments (Conselho Monetário Nacional, 2017). Segments 1 to 4 apply the full methodology, while small institutions may opt for a simplified method of computing minimum capital. A credit cooperative that grows past the threshold, or declines the simplified option, therefore computes capital, risk weights and provisions under the same rules as a commercial bank. International surveys of proportionality record no criterion based on organisational form (Basel Committee on Banking Supervision, 2019), and where supervisors adapt the framework to financial cooperatives the adaptation concerns member shares and network arrangements (Coelho et al., 2019). Theory gives reasons to expect a distinct profile. Cooperative capital is an endowment of retained earnings accumulated across member generations, which outside voting equity cannot top up (Fonteyne, 2007), and the member's claim is a claim on the use of the institution. The cross-country evidence finds cooperative banks more stable, less profitable and less capitalised than commercial banks (Hesse &amp; Čihák, 2007; McKillop et al., 2020). None of this evidence compares the two forms under a common prudential methodology, and comparison groups defined by legal category can include institutions with little economic resemblance to a bank.</w:t>
+        <w:t xml:space="preserve"> Prudential regulation has converged on the Basel template, and national supervisors apply it in proportion to size, complexity and business model. Brazil sorts authorised institutions into five segments (Conselho Monetário Nacional, 2017). Segments 1 to 4 apply the full methodology, while small institutions may opt for a simplified method of computing minimum capital. A credit cooperative that grows past the threshold, or declines the simplified option, therefore computes capital, risk weights and provisions under the same rules as a commercial bank. International surveys of proportionality record no criterion based on organisational form (Basel Committee on Banking Supervision, 2019), and where supervisors adapt the framework to financial cooperatives the adaptation concerns member shares and network arrangements (Coelho et al., 2019). Cooperative capital is an endowment of retained earnings accumulated across member generations (Fonteyne, 2007), and the member's claim is a claim on the use of the institution. The cross-country evidence finds cooperative banks more stable, less profitable and less capitalised than commercial banks (Hesse &amp; Čihák, 2007; McKillop et al., 2020). None of this evidence compares the two forms under a common prudential methodology, and comparison groups defined by legal category can include institutions with little economic resemblance to a bank.</w:t>
       </w:r>
     </w:p>
     <w:p>
@@ -191,7 +191,7 @@
         <w:t xml:space="preserve">Results.</w:t>
       </w:r>
       <w:r>
-        <w:t xml:space="preserve"> Three results emerge. First, at comparable size cooperatives allocate nearly a fifth more of total assets to credit than banks nationally, operate at lower cost at the median, and show lower return volatility and a higher z-score. Before tax the typical cooperative earns more than a comparable bank, on an intermediation margin indistinguishable from the banks': the conditional median differential is 1.4 percentage points and excludes zero, while the mean gap is significant in only two of four specifications, pulled towards zero by a high-earning bank upper tail, and is therefore null by the classification rule. After tax cooperatives retain about two percentage points more, a stable result; the pre-tax gap under controls is about three fifths of the after-tax one, so the exemption of cooperative acts from income tax and social contribution accounts for about two fifths of it. The other differentials hold on every national definition of a bank. Credit intensity cannot be told apart from zero within macro-region, where the estimates are imprecise. Second, capital differs modestly in level and markedly in dispersion. The size-controlled mean gap is large and negative, yet the conditional mean is about seven times the conditional median, and the quantile coefficient is positive at the bottom of the capital distribution and negative at the top, crossing zero near the fortieth percentile. The mean gap comes largely from a bank upper tail. Fourteen percent of bank-quarters exceed a Basel ratio of 50 percent, against one percent of cooperative-quarters, and the tail sits among small standalone banks that barely intermediate. Restricting the comparison to deposit-funded banks roughly halves the gap, and the residual standard deviation of the capital ratio among cooperatives is about a third of the bank figure. Third, two differences often reported disappear once the comparison group is restricted to banks. Against all non-cooperatives, cooperatives appear to provision less and to earn narrower margins; against banks both coefficients are close to zero. The broad-group provisioning gap comes from non-banking lenders whose provisioning ratios are nearly three times those of banks and cooperatives. At the conditional median cooperatives provision more, and no tercile of the capital distribution shows them provisioning less. Every surviving result keeps its sign under four winsorisation rules, without the largest banks, before and after the 2022 revision of the capital rules, and under weighted and unweighted matching. Selection into the full methodology biases the credit and profitability estimates towards zero.</w:t>
+        <w:t xml:space="preserve"> Three results emerge. First, at comparable size cooperatives allocate nearly a fifth more of total assets to credit than banks nationally, operate at lower cost at the median, and show lower return volatility and a higher z-score. Before tax the typical cooperative earns more than a comparable bank, on an intermediation margin indistinguishable from the banks': the conditional median differential is 1.4 percentage points and excludes zero, while the mean gap, pulled towards zero by a high-earning bank upper tail, is significant in only two of four specifications and therefore null by the rule. After tax cooperatives retain about two percentage points more, a stable result; the pre-tax gap under controls is about three fifths of the after-tax one, so the exemption of cooperative acts from income tax and social contribution accounts for about two fifths of it. The other differentials hold on every national definition of a bank. Credit intensity cannot be told apart from zero within macro-region, where the estimates are imprecise. Second, capital differs modestly in level and markedly in dispersion. The size-controlled mean gap is large and negative, yet the conditional mean is about seven times the conditional median, and the quantile coefficient is positive at the bottom of the capital distribution and negative at the top, crossing zero near the fortieth percentile. The mean gap comes largely from a bank upper tail. Fourteen percent of bank-quarters exceed a Basel ratio of 50 percent, against one percent of cooperative-quarters, and the tail sits among small standalone banks that barely intermediate. Restricting the comparison to deposit-funded banks roughly halves the gap, and the residual standard deviation of the capital ratio among cooperatives is about a third of the bank figure. Third, two differences often reported disappear once the comparison group is restricted to banks. Against all non-cooperatives, cooperatives appear to provision less and to earn narrower margins; against banks both coefficients are close to zero. The broad-group provisioning gap comes from non-banking lenders whose provisioning ratios are nearly three times those of banks and cooperatives. At the conditional median cooperatives provision more, and no tercile of the capital distribution shows them provisioning less. Every surviving result keeps its sign under four winsorisation rules, without the largest banks, before and after the 2022 revision of the capital rules, and under weighted and unweighted matching. Selection into the full methodology biases the credit and profitability estimates towards zero.</w:t>
       </w:r>
     </w:p>
     <w:p>
@@ -221,7 +221,7 @@
         <w:t xml:space="preserve">Contributions and Implications.</w:t>
       </w:r>
       <w:r>
-        <w:t xml:space="preserve"> The paper offers the first profile of cooperative behaviour under full Basel-style regulation in a large emerging market, on the full population of full-methodology institutions, together with two nulls that correct claims the same data appear to support under a looser comparison group. Methodologically, it sets out a protocol that defines peers on the regulator's own categories, reports a ladder of comparison groups, separates sector-wide from within-market differences, states how cumulative flows were converted to rates and reports the matched estimand. For proportionality, the results raise two margins beyond size: the treatment of integrated networks and their backstops, and the calibration of a benchmark against an average institution whose upper region cooperatives do not inhabit. A lighter requirement does not follow automatically, since the systemic externality and the public guarantee still apply. For the cooperative movement, a case resting on cost and return stability holds against every definition of a bank we tried, and one resting on profitability holds for the retained return and, for the operating return, at the median rather than at the mean. A case resting on more conservative provisioning does not.</w:t>
+        <w:t xml:space="preserve"> The paper offers the first profile of cooperative behaviour under full Basel-style regulation in a large emerging market, on the full population of full-methodology institutions, together with two nulls that correct claims the same data appear to support under a looser comparison group. Methodologically, it sets out a protocol that defines peers on the regulator's own categories, reports a ladder of comparison groups, separates sector-wide from within-market differences and reports the matched estimand. For proportionality, the results raise two margins beyond size: the treatment of integrated networks and their backstops, and the calibration of a benchmark against an average institution whose upper region cooperatives do not inhabit. A lighter requirement does not follow automatically, since the systemic externality and the public guarantee still apply. For the cooperative movement, a case resting on cost and return stability holds against every definition of a bank we tried, and one resting on profitability holds for the retained return and, for the operating return, at the median rather than at the mean. A case resting on more conservative provisioning does not.</w:t>
       </w:r>
     </w:p>
     <w:p>

</xml_diff>

<commit_message>
Author block: ORCIDs and institutional emails
Co-Authored-By: Claude Fable 5.1 <noreply@anthropic.com>
</commit_message>
<xml_diff>
--- a/paper/ICACCR2026_abstract_Nery_Victorino_Rangel.docx
+++ b/paper/ICACCR2026_abstract_Nery_Victorino_Rangel.docx
@@ -74,7 +74,7 @@
         <w:rPr>
           <w:rStyle w:val="Autor2"/>
         </w:rPr>
-        <w:t xml:space="preserve">Organization of Brazilian Cooperatives (OCB System), Brasília, Brazil, ORCID [0000-0000-0000-0000], arthurgomesqq@gmail.com</w:t>
+        <w:t xml:space="preserve">Organization of Brazilian Cooperatives (OCB System), Brasília, Brazil, ORCID 0000-0001-6844-807X, arthur.nery@ocb.coop.br</w:t>
       </w:r>
       <w:r>
         <w:rPr>
@@ -93,7 +93,7 @@
         <w:rPr>
           <w:rStyle w:val="Autor2"/>
         </w:rPr>
-        <w:t xml:space="preserve">Organization of Brazilian Cooperatives (OCB System), Brasília, Brazil, ORCID [0000-0000-0000-0000], [email]</w:t>
+        <w:t xml:space="preserve">Organization of Brazilian Cooperatives (OCB System), Brasília, Brazil, ORCID 0000-0003-0110-762X, thiago.victorino@sescoop.coop.br</w:t>
       </w:r>
       <w:r>
         <w:rPr>
@@ -112,7 +112,7 @@
         <w:rPr>
           <w:rStyle w:val="Autor2"/>
         </w:rPr>
-        <w:t xml:space="preserve">Organization of Brazilian Cooperatives (OCB System), Brasília, Brazil, ORCID [0000-0000-0000-0000], [email]</w:t>
+        <w:t xml:space="preserve">Organization of Brazilian Cooperatives (OCB System), Brasília, Brazil, rodrigo.rangel@sescoop.coop.br</w:t>
       </w:r>
     </w:p>
     <w:p>

</xml_diff>

<commit_message>
Margin stated as not differing at the mean only (its conditional median is positive); sample described as the cooperatives and banks under the full methodology
Co-Authored-By: Claude Fable 5.1 <noreply@anthropic.com>
</commit_message>
<xml_diff>
--- a/paper/ICACCR2026_abstract_Nery_Victorino_Rangel.docx
+++ b/paper/ICACCR2026_abstract_Nery_Victorino_Rangel.docx
@@ -176,7 +176,7 @@
         <w:t xml:space="preserve">Methods.</w:t>
       </w:r>
       <w:r>
-        <w:t xml:space="preserve"> We build an institution-quarter panel from IF.data, the public repository of the Central Bank of Brazil, covering every full-methodology institution from the first quarter of 2017 to the last quarter of 2024: 130 singular credit cooperatives and 144 banks, 7,234 institution-quarters. Institutions are classified on the regulator's consolidation type, which makes cooperative status time-invariant, and central cooperatives are excluded as wholesale entities. Nine quarterly outcomes cover the Basel capital ratio, leverage, return on assets after and before tax, the intermediation margin, cost-to-income, credit intensity, the provisioning ratio and the funding ratio. Two stability outcomes, return volatility and the z-score, are measured at the institution level. Two features of the source data are corrected: income fields accumulate within the semester and are de-cumulated and annualised, and the intermediation result is reported net of loan-loss provisions and is computed gross. Each outcome is related to a cooperative dummy under four specifications: the unconditional difference, controls for log assets and quarter, coarsened exact matching on size with the weighted estimand reported, and the region of common support. The comparison side is a reported parameter with five rungs: all non-cooperatives, banks, banks within macro-region, commercial banks and deposit-funded banks. Standard errors are clustered by institution and confirmed by a restricted wild cluster bootstrap (Cameron et al., 2008; MacKinnon &amp; Webb, 2017). Conditional medians and quantile regressions are reported beside the conditional means, and an explicit rule classifies each outcome as null, stable or stable in sign.</w:t>
+        <w:t xml:space="preserve"> We build an institution-quarter panel from IF.data, the public repository of the Central Bank of Brazil, covering the cooperatives and banks under the full methodology from the first quarter of 2017 to the last quarter of 2024: 130 singular credit cooperatives and 144 banks, 7,234 institution-quarters. Institutions are classified on the regulator's consolidation type, which makes cooperative status time-invariant, and central cooperatives are excluded as wholesale entities. Nine quarterly outcomes cover the Basel capital ratio, leverage, return on assets after and before tax, the intermediation margin, cost-to-income, credit intensity, the provisioning ratio and the funding ratio. Two stability outcomes, return volatility and the z-score, are measured at the institution level. Two features of the source data are corrected: income fields accumulate within the semester and are de-cumulated and annualised, and the intermediation result is reported net of loan-loss provisions and is computed gross. Each outcome is related to a cooperative dummy under four specifications: the unconditional difference, controls for log assets and quarter, coarsened exact matching on size with the weighted estimand reported, and the region of common support. The comparison side is a reported parameter with five rungs: all non-cooperatives, banks, banks within macro-region, commercial banks and deposit-funded banks. Standard errors are clustered by institution and confirmed by a restricted wild cluster bootstrap (Cameron et al., 2008; MacKinnon &amp; Webb, 2017). Conditional medians and quantile regressions are reported beside the conditional means, and an explicit rule classifies each outcome as null, stable or stable in sign.</w:t>
       </w:r>
     </w:p>
     <w:p>
@@ -221,7 +221,7 @@
         <w:t xml:space="preserve">Contributions and Implications.</w:t>
       </w:r>
       <w:r>
-        <w:t xml:space="preserve"> The paper offers the first profile of cooperative behaviour under full Basel-style regulation in a large emerging market, on the full population of full-methodology institutions, together with two nulls that correct claims the same data appear to support under a looser comparison group. Methodologically, it sets out a protocol that defines peers on the regulator's own categories, reports a ladder of comparison groups, separates sector-wide from within-market differences and reports the matched estimand. For proportionality, the results raise two margins beyond size: the treatment of integrated networks and their backstops, and the calibration of a benchmark against an average institution whose upper region cooperatives do not inhabit. A lighter requirement does not follow automatically, since the systemic externality and the guarantee still apply. For the cooperative movement, a case resting on cost and return stability holds against every definition of a bank we tried, and one resting on profitability holds for the retained return and, for the operating return, at the median rather than at the mean. A case resting on more conservative provisioning does not.</w:t>
+        <w:t xml:space="preserve"> The paper offers the first profile of cooperative behaviour under full Basel-style regulation in a large emerging market, on the full population of cooperatives and banks under the full methodology, together with two nulls that correct claims the same data appear to support under a looser comparison group. Methodologically, it sets out a protocol that defines peers on the regulator's own categories, reports a ladder of comparison groups, separates sector-wide from within-market differences and reports the matched estimand. For proportionality, the results raise two margins beyond size: the treatment of integrated networks and their backstops, and the calibration of a benchmark against an average institution whose upper region cooperatives do not inhabit. A lighter requirement does not follow automatically, since the systemic externality and the guarantee still apply. For the cooperative movement, a case resting on cost and return stability holds against every definition of a bank we tried, and one resting on profitability holds for the retained return and, for the operating return, at the median rather than at the mean. A case resting on more conservative provisioning does not.</w:t>
       </w:r>
     </w:p>
     <w:p>

</xml_diff>

<commit_message>
Proceedings abstract: margin wording aligned with the paper; back under 1,500 words
Co-Authored-By: Claude Fable 5.1 <noreply@anthropic.com>
</commit_message>
<xml_diff>
--- a/paper/ICACCR2026_abstract_Nery_Victorino_Rangel.docx
+++ b/paper/ICACCR2026_abstract_Nery_Victorino_Rangel.docx
@@ -191,7 +191,7 @@
         <w:t xml:space="preserve">Results.</w:t>
       </w:r>
       <w:r>
-        <w:t xml:space="preserve"> Three results emerge. First, at comparable size cooperatives allocate nearly a fifth more of total assets to credit than banks nationally, operate at lower cost at the median, and show lower return volatility and a higher z-score. Before tax the typical cooperative earns more than a comparable bank, on an intermediation margin indistinguishable from the banks'. The conditional median differential is 1.4 percentage points and excludes zero; the mean gap is significant in only two of four specifications, pulled towards zero by a high-earning bank upper tail, and is therefore null by the rule. After tax cooperatives retain about two percentage points more, a stable result. The pre-tax gap under controls is three fifths of the after-tax one, so the tax exemption of cooperative acts accounts for about two fifths. The other differentials hold on every national definition of a bank. Credit intensity cannot be told apart from zero within macro-region, where the estimates are imprecise. Second, capital differs modestly in level and markedly in dispersion. The size-controlled mean gap is large and negative, yet the conditional mean is about seven times the conditional median, and the quantile coefficient is positive at the bottom of the capital distribution and negative at the top, crossing zero near the fortieth percentile. The mean gap comes largely from a bank upper tail. Fourteen percent of bank-quarters exceed a Basel ratio of 50 percent, against one percent of cooperative-quarters, and the tail sits among small standalone banks that barely intermediate. Restricting the comparison to deposit-funded banks roughly halves the gap, and the residual standard deviation of the capital ratio among cooperatives is about a third of the bank figure. Third, two differences often reported disappear once the comparison group is restricted to banks. Against all non-cooperatives, cooperatives appear to provision less and to earn narrower margins; against banks both coefficients are close to zero. The broad-group provisioning gap comes from non-banking lenders whose provisioning ratios are nearly three times those of banks and cooperatives. At the conditional median cooperatives provision more, and no tercile of the capital distribution shows them provisioning less. Every surviving result keeps its sign under four winsorisation rules, without the largest banks, before and after the 2022 revision of the capital rules, and under weighted and unweighted matching. Selection into the full methodology bears on generalisation: the estimates describe the adopters, and the wider cooperative population would, if anything, show larger credit and profitability differentials.</w:t>
+        <w:t xml:space="preserve"> Three results emerge. First, at comparable size cooperatives allocate nearly a fifth more of total assets to credit than banks nationally, operate at lower cost at the median, and show lower return volatility and a higher z-score. Before tax the typical cooperative earns more than a comparable bank. The conditional median differential is 1.4 percentage points and excludes zero; the mean gap is significant in only two of four specifications, pulled towards zero by a high-earning bank upper tail, and is therefore null by the rule. After tax cooperatives retain about two percentage points more, a stable result. The pre-tax gap under controls is three fifths of the after-tax one, so the tax exemption of cooperative acts accounts for about two fifths. The other differentials hold on every national definition of a bank. Credit intensity cannot be told apart from zero within macro-region, where the estimates are imprecise. Second, capital differs modestly in level and markedly in dispersion. The size-controlled mean gap is large and negative, yet the conditional mean is about seven times the conditional median, and the quantile coefficient is positive at the bottom of the capital distribution and negative at the top, crossing zero near the fortieth percentile. The mean gap comes largely from a bank upper tail. Fourteen percent of bank-quarters exceed a Basel ratio of 50 percent, against one percent of cooperative-quarters, and the tail sits among small standalone banks that barely intermediate. Restricting the comparison to deposit-funded banks roughly halves the gap, and the residual standard deviation of the capital ratio among cooperatives is about a third of the bank figure. Third, two differences often reported disappear once the comparison group is restricted to banks. Against all non-cooperatives, cooperatives appear to provision less and to earn narrower margins; against banks both coefficients are close to zero. The broad-group provisioning gap comes from non-banking lenders whose provisioning ratios are nearly three times those of banks and cooperatives. At the conditional median cooperatives provision more, and no tercile of the capital distribution shows them provisioning less. Every surviving result keeps its sign under four winsorisation rules, without the largest banks, before and after the 2022 revision of the capital rules, and under weighted and unweighted matching. Selection into the full methodology bears on generalisation: the estimates describe the adopters, and the wider cooperative population would, if anything, show larger credit and profitability differentials.</w:t>
       </w:r>
     </w:p>
     <w:p>
@@ -206,7 +206,7 @@
         <w:t xml:space="preserve">Discussion.</w:t>
       </w:r>
       <w:r>
-        <w:t xml:space="preserve"> The surviving results describe a focused retail lender that channels a high share of its assets into member credit, runs that operation at low cost, earns a somewhat higher operating return than banks at the median on similar spreads, retains more of it after tax and sits in a narrow band of the capital distribution. The results agree with Hesse and Čihák (2007) on lower capitalisation and lower return volatility and differ on profitability; the fiscal treatment of cooperative acts accounts for about two fifths of the after-tax difference, and the pre-tax mean gap is not established, so the disagreement is narrower than the after-tax figures suggest. At the thin end of the capital distribution, where supervisory concern attaches, cooperatives hold more capital than comparable banks and provision no less. Several differentials that look large at the mean are differentials in dispersion. Three analyst choices determined whether headline results existed: the comparison group, the reading of cumulative income fields as quarterly flows, and unweighted estimation on the matched sample. The estimates are conditional correlations on the largest cooperatives in the country, the provisioning ratio is an accounting variable, and the network backstop hypothesis needs consolidated data that IF.data does not carry.</w:t>
+        <w:t xml:space="preserve"> The surviving results describe a focused retail lender that channels a high share of its assets into member credit, runs that operation at low cost, earns a somewhat higher operating return than banks at the median, retains more of it after tax and sits in a narrow band of the capital distribution. The results agree with Hesse and Čihák (2007) on lower capitalisation and lower return volatility and differ on profitability; the fiscal treatment of cooperative acts accounts for about two fifths of the after-tax difference, and the pre-tax mean gap is not established, so the disagreement is narrower than the after-tax figures suggest. At the thin end of the capital distribution, where supervisory concern attaches, cooperatives hold more capital than comparable banks and provision no less. Several differentials that look large at the mean are differentials in dispersion. Three analyst choices determined whether headline results existed: the comparison group, the reading of cumulative income fields as quarterly flows, and unweighted estimation on the matched sample. The estimates are conditional correlations on the largest cooperatives in the country, the provisioning ratio is an accounting variable, and the network backstop hypothesis needs consolidated data that IF.data does not carry.</w:t>
       </w:r>
     </w:p>
     <w:p>

</xml_diff>